<commit_message>
Gertler et al. (2018): página do racionamento corrigida para 74, conferida no texto do relé
Co-Authored-By: Claude Opus 5.5 <noreply@anthropic.com>
Claude-Session: https://claude.ai/code/session_01XEaG1GvUXhdfnXot6AtJxa
</commit_message>
<xml_diff>
--- a/artigo/revisao-final/frase-a-frase.docx
+++ b/artigo/revisao-final/frase-a-frase.docx
@@ -45,7 +45,7 @@
         <w:rPr>
           <w:rStyle w:val="VerbatimChar"/>
         </w:rPr>
-        <w:t xml:space="preserve">9bd349035841425f…</w:t>
+        <w:t xml:space="preserve">82625184ce5c4728…</w:t>
       </w:r>
       <w:r>
         <w:t xml:space="preserve">, gerado por</w:t>
@@ -6496,7 +6496,7 @@
         <w:t xml:space="preserve">et al.</w:t>
       </w:r>
       <w:r>
-        <w:t xml:space="preserve">, 2018, p. 75).</w:t>
+        <w:t xml:space="preserve">, 2018, p. 74).</w:t>
       </w:r>
     </w:p>
     <w:p>
@@ -6521,7 +6521,7 @@
         <w:t xml:space="preserve">et al.</w:t>
       </w:r>
       <w:r>
-        <w:t xml:space="preserve">, 2018, p. 75</w:t>
+        <w:t xml:space="preserve">, 2018, p. 74</w:t>
       </w:r>
     </w:p>
     <w:p>

</xml_diff>